<commit_message>
change the structure, fix a lot of stuff, add a new report
</commit_message>
<xml_diff>
--- a/Mil.Paperwork.Domain/Templates/ExtractFromBookOfLossesTemplate.docx
+++ b/Mil.Paperwork.Domain/Templates/ExtractFromBookOfLossesTemplate.docx
@@ -1,6 +1,6 @@
 
 <file path=word/document.xml><?xml version="1.0" encoding="utf-8"?>
-<w:document xmlns:wpc="http://schemas.microsoft.com/office/word/2010/wordprocessingCanvas" xmlns:cx="http://schemas.microsoft.com/office/drawing/2014/chartex" xmlns:cx1="http://schemas.microsoft.com/office/drawing/2015/9/8/chartex" xmlns:cx2="http://schemas.microsoft.com/office/drawing/2015/10/21/chartex" xmlns:cx3="http://schemas.microsoft.com/office/drawing/2016/5/9/chartex" xmlns:cx4="http://schemas.microsoft.com/office/drawing/2016/5/10/chartex" xmlns:cx5="http://schemas.microsoft.com/office/drawing/2016/5/11/chartex" xmlns:cx6="http://schemas.microsoft.com/office/drawing/2016/5/12/chartex" xmlns:cx7="http://schemas.microsoft.com/office/drawing/2016/5/13/chartex" xmlns:cx8="http://schemas.microsoft.com/office/drawing/2016/5/14/chartex" xmlns:mc="http://schemas.openxmlformats.org/markup-compatibility/2006" xmlns:aink="http://schemas.microsoft.com/office/drawing/2016/ink" xmlns:am3d="http://schemas.microsoft.com/office/drawing/2017/model3d" xmlns:o="urn:schemas-microsoft-com:office:office" xmlns:r="http://schemas.openxmlformats.org/officeDocument/2006/relationships" xmlns:m="http://schemas.openxmlformats.org/officeDocument/2006/math" xmlns:v="urn:schemas-microsoft-com:vml" xmlns:wp14="http://schemas.microsoft.com/office/word/2010/wordprocessingDrawing" xmlns:wp="http://schemas.openxmlformats.org/drawingml/2006/wordprocessingDrawing" xmlns:w10="urn:schemas-microsoft-com:office:word" xmlns:w="http://schemas.openxmlformats.org/wordprocessingml/2006/main" xmlns:w14="http://schemas.microsoft.com/office/word/2010/wordml" xmlns:w15="http://schemas.microsoft.com/office/word/2012/wordml" xmlns:w16cex="http://schemas.microsoft.com/office/word/2018/wordml/cex" xmlns:w16cid="http://schemas.microsoft.com/office/word/2016/wordml/cid" xmlns:w16="http://schemas.microsoft.com/office/word/2018/wordml" xmlns:w16sdtdh="http://schemas.microsoft.com/office/word/2020/wordml/sdtdatahash" xmlns:w16se="http://schemas.microsoft.com/office/word/2015/wordml/symex" xmlns:wpg="http://schemas.microsoft.com/office/word/2010/wordprocessingGroup" xmlns:wpi="http://schemas.microsoft.com/office/word/2010/wordprocessingInk" xmlns:wne="http://schemas.microsoft.com/office/word/2006/wordml" xmlns:wps="http://schemas.microsoft.com/office/word/2010/wordprocessingShape" mc:Ignorable="w14 w15 w16se w16cid w16 w16cex w16sdtdh wp14">
+<w:document xmlns:wpc="http://schemas.microsoft.com/office/word/2010/wordprocessingCanvas" xmlns:cx="http://schemas.microsoft.com/office/drawing/2014/chartex" xmlns:cx1="http://schemas.microsoft.com/office/drawing/2015/9/8/chartex" xmlns:cx2="http://schemas.microsoft.com/office/drawing/2015/10/21/chartex" xmlns:cx3="http://schemas.microsoft.com/office/drawing/2016/5/9/chartex" xmlns:cx4="http://schemas.microsoft.com/office/drawing/2016/5/10/chartex" xmlns:cx5="http://schemas.microsoft.com/office/drawing/2016/5/11/chartex" xmlns:cx6="http://schemas.microsoft.com/office/drawing/2016/5/12/chartex" xmlns:cx7="http://schemas.microsoft.com/office/drawing/2016/5/13/chartex" xmlns:cx8="http://schemas.microsoft.com/office/drawing/2016/5/14/chartex" xmlns:mc="http://schemas.openxmlformats.org/markup-compatibility/2006" xmlns:aink="http://schemas.microsoft.com/office/drawing/2016/ink" xmlns:am3d="http://schemas.microsoft.com/office/drawing/2017/model3d" xmlns:o="urn:schemas-microsoft-com:office:office" xmlns:oel="http://schemas.microsoft.com/office/2019/extlst" xmlns:r="http://schemas.openxmlformats.org/officeDocument/2006/relationships" xmlns:m="http://schemas.openxmlformats.org/officeDocument/2006/math" xmlns:v="urn:schemas-microsoft-com:vml" xmlns:wp14="http://schemas.microsoft.com/office/word/2010/wordprocessingDrawing" xmlns:wp="http://schemas.openxmlformats.org/drawingml/2006/wordprocessingDrawing" xmlns:w10="urn:schemas-microsoft-com:office:word" xmlns:w="http://schemas.openxmlformats.org/wordprocessingml/2006/main" xmlns:w14="http://schemas.microsoft.com/office/word/2010/wordml" xmlns:w15="http://schemas.microsoft.com/office/word/2012/wordml" xmlns:w16cex="http://schemas.microsoft.com/office/word/2018/wordml/cex" xmlns:w16cid="http://schemas.microsoft.com/office/word/2016/wordml/cid" xmlns:w16="http://schemas.microsoft.com/office/word/2018/wordml" xmlns:w16du="http://schemas.microsoft.com/office/word/2023/wordml/word16du" xmlns:w16sdtdh="http://schemas.microsoft.com/office/word/2020/wordml/sdtdatahash" xmlns:w16se="http://schemas.microsoft.com/office/word/2015/wordml/symex" xmlns:wpg="http://schemas.microsoft.com/office/word/2010/wordprocessingGroup" xmlns:wpi="http://schemas.microsoft.com/office/word/2010/wordprocessingInk" xmlns:wne="http://schemas.microsoft.com/office/word/2006/wordml" xmlns:wps="http://schemas.microsoft.com/office/word/2010/wordprocessingShape" mc:Ignorable="w14 w15 w16se w16cid w16 w16cex w16sdtdh w16du wp14">
   <w:body>
     <w:p>
       <w:pPr>
@@ -82,56 +82,123 @@
       </w:pPr>
       <w:r>
         <w:rPr>
+          <w:bCs/>
+          <w:sz w:val="24"/>
+          <w:szCs w:val="24"/>
+        </w:rPr>
+        <w:t xml:space="preserve">з книги обліку </w:t>
+      </w:r>
+      <w:r>
+        <w:rPr>
+          <w:bCs/>
+          <w:sz w:val="24"/>
+          <w:szCs w:val="24"/>
+        </w:rPr>
+        <w:t>втрат військового майна служби зв’язку</w:t>
+      </w:r>
+      <w:r>
+        <w:rPr>
+          <w:bCs/>
+          <w:sz w:val="24"/>
+          <w:szCs w:val="24"/>
+        </w:rPr>
+        <w:t xml:space="preserve"> військової частини </w:t>
+      </w:r>
+      <w:bookmarkStart w:id="1" w:name="_Hlk210685201"/>
+      <w:r>
+        <w:rPr>
+          <w:bCs/>
+          <w:color w:val="000000"/>
+          <w:sz w:val="24"/>
+          <w:szCs w:val="24"/>
+        </w:rPr>
+        <w:fldChar w:fldCharType="begin"/>
+      </w:r>
+      <w:r>
+        <w:rPr>
+          <w:bCs/>
+          <w:color w:val="000000"/>
+          <w:sz w:val="24"/>
+          <w:szCs w:val="24"/>
+        </w:rPr>
+        <w:instrText xml:space="preserve"> MERGEFIELD  MIL_UNIT  \* MERGEFORMAT </w:instrText>
+      </w:r>
+      <w:r>
+        <w:rPr>
+          <w:bCs/>
+          <w:color w:val="000000"/>
+          <w:sz w:val="24"/>
+          <w:szCs w:val="24"/>
+        </w:rPr>
+        <w:fldChar w:fldCharType="separate"/>
+      </w:r>
+      <w:r>
+        <w:rPr>
+          <w:bCs/>
+          <w:noProof/>
+          <w:color w:val="000000"/>
+          <w:sz w:val="24"/>
+          <w:szCs w:val="24"/>
+        </w:rPr>
+        <w:t>«MIL_UNIT»</w:t>
+      </w:r>
+      <w:r>
+        <w:rPr>
+          <w:bCs/>
+          <w:color w:val="000000"/>
+          <w:sz w:val="24"/>
+          <w:szCs w:val="24"/>
+        </w:rPr>
+        <w:fldChar w:fldCharType="end"/>
+      </w:r>
+      <w:bookmarkEnd w:id="0"/>
+      <w:bookmarkEnd w:id="1"/>
+      <w:r>
+        <w:rPr>
           <w:b/>
           <w:sz w:val="24"/>
           <w:szCs w:val="24"/>
-        </w:rPr>
-        <w:t xml:space="preserve">з книги обліку </w:t>
-      </w:r>
-      <w:r>
-        <w:rPr>
-          <w:b/>
-          <w:sz w:val="24"/>
-          <w:szCs w:val="24"/>
-        </w:rPr>
-        <w:t>втрат військового майна служби зв’язку</w:t>
-      </w:r>
-      <w:r>
-        <w:rPr>
-          <w:b/>
-          <w:sz w:val="24"/>
-          <w:szCs w:val="24"/>
-        </w:rPr>
-        <w:t xml:space="preserve"> військової частини </w:t>
-      </w:r>
-      <w:bookmarkStart w:id="1" w:name="_Hlk210685201"/>
+          <w:lang w:eastAsia="en-US"/>
+        </w:rPr>
+        <w:t xml:space="preserve"> </w:t>
+      </w:r>
       <w:r>
         <w:rPr>
           <w:b/>
           <w:bCs/>
-          <w:color w:val="000000"/>
-          <w:sz w:val="24"/>
-          <w:szCs w:val="24"/>
-        </w:rPr>
-        <w:fldChar w:fldCharType="begin"/>
+          <w:sz w:val="24"/>
+          <w:szCs w:val="24"/>
+          <w:u w:val="single"/>
+        </w:rPr>
+        <w:t>№</w:t>
       </w:r>
       <w:r>
         <w:rPr>
           <w:b/>
           <w:bCs/>
-          <w:color w:val="000000"/>
-          <w:sz w:val="24"/>
-          <w:szCs w:val="24"/>
-        </w:rPr>
-        <w:instrText xml:space="preserve"> MERGEFIELD  MIL_UNIT  \* MERGEFORMAT </w:instrText>
+          <w:sz w:val="24"/>
+          <w:szCs w:val="24"/>
+          <w:u w:val="single"/>
+        </w:rPr>
+        <w:fldChar w:fldCharType="begin"/>
       </w:r>
       <w:r>
         <w:rPr>
           <w:b/>
           <w:bCs/>
-          <w:color w:val="000000"/>
-          <w:sz w:val="24"/>
-          <w:szCs w:val="24"/>
+          <w:sz w:val="24"/>
+          <w:szCs w:val="24"/>
+          <w:u w:val="single"/>
+        </w:rPr>
+        <w:instrText xml:space="preserve"> MERGEFIELD  BOOK_NUM  \* MERGEFORMAT </w:instrText>
+      </w:r>
+      <w:r>
+        <w:rPr>
+          <w:b/>
+          <w:bCs/>
+          <w:sz w:val="24"/>
+          <w:szCs w:val="24"/>
+          <w:u w:val="single"/>
         </w:rPr>
         <w:fldChar w:fldCharType="separate"/>
       </w:r>
@@ -140,203 +207,16 @@
           <w:b/>
           <w:bCs/>
           <w:noProof/>
-          <w:color w:val="000000"/>
-          <w:sz w:val="24"/>
-          <w:szCs w:val="24"/>
-        </w:rPr>
-        <w:t>«MIL_UNIT»</w:t>
+          <w:sz w:val="24"/>
+          <w:szCs w:val="24"/>
+          <w:u w:val="single"/>
+        </w:rPr>
+        <w:t>«BOOK_NUM»</w:t>
       </w:r>
       <w:r>
         <w:rPr>
           <w:b/>
           <w:bCs/>
-          <w:color w:val="000000"/>
-          <w:sz w:val="24"/>
-          <w:szCs w:val="24"/>
-        </w:rPr>
-        <w:fldChar w:fldCharType="end"/>
-      </w:r>
-      <w:bookmarkEnd w:id="1"/>
-    </w:p>
-    <w:bookmarkEnd w:id="0"/>
-    <w:p>
-      <w:pPr>
-        <w:jc w:val="center"/>
-        <w:rPr>
-          <w:sz w:val="24"/>
-          <w:szCs w:val="24"/>
-          <w:u w:val="single"/>
-        </w:rPr>
-      </w:pPr>
-      <w:r>
-        <w:rPr>
-          <w:sz w:val="24"/>
-          <w:szCs w:val="24"/>
-        </w:rPr>
-        <w:t xml:space="preserve">за номенклатурою справ на </w:t>
-      </w:r>
-      <w:r>
-        <w:rPr>
-          <w:sz w:val="24"/>
-          <w:szCs w:val="24"/>
-        </w:rPr>
-        <w:fldChar w:fldCharType="begin"/>
-      </w:r>
-      <w:r>
-        <w:rPr>
-          <w:sz w:val="24"/>
-          <w:szCs w:val="24"/>
-        </w:rPr>
-        <w:instrText xml:space="preserve"> MERGEFIELD  BOOK_YEAR  \* MERGEFORMAT </w:instrText>
-      </w:r>
-      <w:r>
-        <w:rPr>
-          <w:sz w:val="24"/>
-          <w:szCs w:val="24"/>
-        </w:rPr>
-        <w:fldChar w:fldCharType="separate"/>
-      </w:r>
-      <w:r>
-        <w:rPr>
-          <w:noProof/>
-          <w:sz w:val="24"/>
-          <w:szCs w:val="24"/>
-        </w:rPr>
-        <w:t>«BOOK_YEAR»</w:t>
-      </w:r>
-      <w:r>
-        <w:rPr>
-          <w:sz w:val="24"/>
-          <w:szCs w:val="24"/>
-        </w:rPr>
-        <w:fldChar w:fldCharType="end"/>
-      </w:r>
-      <w:r>
-        <w:rPr>
-          <w:sz w:val="24"/>
-          <w:szCs w:val="24"/>
-          <w:lang w:val="en-US"/>
-        </w:rPr>
-        <w:t xml:space="preserve"> </w:t>
-      </w:r>
-      <w:r>
-        <w:rPr>
-          <w:sz w:val="24"/>
-          <w:szCs w:val="24"/>
-        </w:rPr>
-        <w:t xml:space="preserve">рік </w:t>
-      </w:r>
-      <w:r>
-        <w:rPr>
-          <w:b/>
-          <w:bCs/>
-          <w:sz w:val="24"/>
-          <w:szCs w:val="24"/>
-          <w:u w:val="single"/>
-        </w:rPr>
-        <w:t>№</w:t>
-      </w:r>
-      <w:r>
-        <w:rPr>
-          <w:b/>
-          <w:bCs/>
-          <w:sz w:val="24"/>
-          <w:szCs w:val="24"/>
-          <w:u w:val="single"/>
-        </w:rPr>
-        <w:fldChar w:fldCharType="begin"/>
-      </w:r>
-      <w:r>
-        <w:rPr>
-          <w:b/>
-          <w:bCs/>
-          <w:sz w:val="24"/>
-          <w:szCs w:val="24"/>
-          <w:u w:val="single"/>
-        </w:rPr>
-        <w:instrText xml:space="preserve"> MERGEFIELD  BOOK_NUM  \* MERGEFORMAT </w:instrText>
-      </w:r>
-      <w:r>
-        <w:rPr>
-          <w:b/>
-          <w:bCs/>
-          <w:sz w:val="24"/>
-          <w:szCs w:val="24"/>
-          <w:u w:val="single"/>
-        </w:rPr>
-        <w:fldChar w:fldCharType="separate"/>
-      </w:r>
-      <w:r>
-        <w:rPr>
-          <w:b/>
-          <w:bCs/>
-          <w:noProof/>
-          <w:sz w:val="24"/>
-          <w:szCs w:val="24"/>
-          <w:u w:val="single"/>
-        </w:rPr>
-        <w:t>«BOOK_NUM»</w:t>
-      </w:r>
-      <w:r>
-        <w:rPr>
-          <w:b/>
-          <w:bCs/>
-          <w:sz w:val="24"/>
-          <w:szCs w:val="24"/>
-          <w:u w:val="single"/>
-        </w:rPr>
-        <w:fldChar w:fldCharType="end"/>
-      </w:r>
-      <w:r>
-        <w:rPr>
-          <w:sz w:val="24"/>
-          <w:szCs w:val="24"/>
-          <w:lang w:val="en-US"/>
-        </w:rPr>
-        <w:t xml:space="preserve"> </w:t>
-      </w:r>
-      <w:r>
-        <w:rPr>
-          <w:sz w:val="24"/>
-          <w:szCs w:val="24"/>
-        </w:rPr>
-        <w:t xml:space="preserve">сторінка № </w:t>
-      </w:r>
-      <w:r>
-        <w:rPr>
-          <w:sz w:val="24"/>
-          <w:szCs w:val="24"/>
-          <w:u w:val="single"/>
-        </w:rPr>
-        <w:fldChar w:fldCharType="begin"/>
-      </w:r>
-      <w:r>
-        <w:rPr>
-          <w:sz w:val="24"/>
-          <w:szCs w:val="24"/>
-          <w:u w:val="single"/>
-        </w:rPr>
-        <w:instrText xml:space="preserve"> MERGEFIELD  PAGE_NUM  \* MERGEFORMAT </w:instrText>
-      </w:r>
-      <w:r>
-        <w:rPr>
-          <w:sz w:val="24"/>
-          <w:szCs w:val="24"/>
-          <w:u w:val="single"/>
-        </w:rPr>
-        <w:fldChar w:fldCharType="separate"/>
-      </w:r>
-      <w:r>
-        <w:rPr>
-          <w:noProof/>
-          <w:sz w:val="24"/>
-          <w:szCs w:val="24"/>
-          <w:u w:val="single"/>
-        </w:rPr>
-        <w:t>«PAGE_NUM»</w:t>
-      </w:r>
-      <w:r>
-        <w:rPr>
           <w:sz w:val="24"/>
           <w:szCs w:val="24"/>
           <w:u w:val="single"/>
@@ -2129,6 +2009,7 @@
                 <w:lang w:eastAsia="uk-UA"/>
               </w:rPr>
             </w:pPr>
+            <w:proofErr w:type="spellStart"/>
             <w:r>
               <w:rPr>
                 <w:color w:val="000000"/>
@@ -2138,6 +2019,7 @@
               </w:rPr>
               <w:t>Розукомпле-ктування</w:t>
             </w:r>
+            <w:proofErr w:type="spellEnd"/>
           </w:p>
         </w:tc>
         <w:tc>
@@ -3385,8 +3267,9 @@
                 <w:szCs w:val="16"/>
                 <w:lang w:eastAsia="uk-UA"/>
               </w:rPr>
-              <w:t>«ORDEN_DATE»</w:t>
-            </w:r>
+              <w:t>«</w:t>
+            </w:r>
+            <w:proofErr w:type="spellStart"/>
             <w:r>
               <w:rPr>
                 <w:b/>
@@ -3395,7 +3278,7 @@
                 <w:szCs w:val="16"/>
                 <w:lang w:eastAsia="uk-UA"/>
               </w:rPr>
-              <w:fldChar w:fldCharType="end"/>
+              <w:t>ORDEN_DATE»</w:t>
             </w:r>
             <w:r>
               <w:rPr>
@@ -3405,7 +3288,28 @@
                 <w:szCs w:val="16"/>
                 <w:lang w:eastAsia="uk-UA"/>
               </w:rPr>
-              <w:t>р №</w:t>
+              <w:fldChar w:fldCharType="end"/>
+            </w:r>
+            <w:r>
+              <w:rPr>
+                <w:b/>
+                <w:bCs/>
+                <w:sz w:val="16"/>
+                <w:szCs w:val="16"/>
+                <w:lang w:eastAsia="uk-UA"/>
+              </w:rPr>
+              <w:t>р</w:t>
+            </w:r>
+            <w:proofErr w:type="spellEnd"/>
+            <w:r>
+              <w:rPr>
+                <w:b/>
+                <w:bCs/>
+                <w:sz w:val="16"/>
+                <w:szCs w:val="16"/>
+                <w:lang w:eastAsia="uk-UA"/>
+              </w:rPr>
+              <w:t xml:space="preserve"> №</w:t>
             </w:r>
             <w:r>
               <w:rPr>
@@ -4644,7 +4548,7 @@
           <w:szCs w:val="24"/>
           <w:lang w:val="ru-RU"/>
         </w:rPr>
-        <w:t>2025</w:t>
+        <w:t>2026</w:t>
       </w:r>
       <w:r>
         <w:rPr>
@@ -4687,7 +4591,7 @@
 </file>
 
 <file path=word/styles.xml><?xml version="1.0" encoding="utf-8"?>
-<w:styles xmlns:mc="http://schemas.openxmlformats.org/markup-compatibility/2006" xmlns:r="http://schemas.openxmlformats.org/officeDocument/2006/relationships" xmlns:w="http://schemas.openxmlformats.org/wordprocessingml/2006/main" xmlns:w14="http://schemas.microsoft.com/office/word/2010/wordml" xmlns:w15="http://schemas.microsoft.com/office/word/2012/wordml" xmlns:w16cex="http://schemas.microsoft.com/office/word/2018/wordml/cex" xmlns:w16cid="http://schemas.microsoft.com/office/word/2016/wordml/cid" xmlns:w16="http://schemas.microsoft.com/office/word/2018/wordml" xmlns:w16sdtdh="http://schemas.microsoft.com/office/word/2020/wordml/sdtdatahash" xmlns:w16se="http://schemas.microsoft.com/office/word/2015/wordml/symex" mc:Ignorable="w14 w15 w16se w16cid w16 w16cex w16sdtdh">
+<w:styles xmlns:mc="http://schemas.openxmlformats.org/markup-compatibility/2006" xmlns:r="http://schemas.openxmlformats.org/officeDocument/2006/relationships" xmlns:w="http://schemas.openxmlformats.org/wordprocessingml/2006/main" xmlns:w14="http://schemas.microsoft.com/office/word/2010/wordml" xmlns:w15="http://schemas.microsoft.com/office/word/2012/wordml" xmlns:w16cex="http://schemas.microsoft.com/office/word/2018/wordml/cex" xmlns:w16cid="http://schemas.microsoft.com/office/word/2016/wordml/cid" xmlns:w16="http://schemas.microsoft.com/office/word/2018/wordml" xmlns:w16du="http://schemas.microsoft.com/office/word/2023/wordml/word16du" xmlns:w16sdtdh="http://schemas.microsoft.com/office/word/2020/wordml/sdtdatahash" xmlns:w16se="http://schemas.microsoft.com/office/word/2015/wordml/symex" mc:Ignorable="w14 w15 w16se w16cid w16 w16cex w16sdtdh w16du">
   <w:docDefaults>
     <w:rPrDefault>
       <w:rPr>

</xml_diff>

<commit_message>
change the structure, fix a lot of stuff, add a new report (#42)
* change the structure, fix a lot of stuff, add a new report

* fix certificates password issue

* fix certificate
</commit_message>
<xml_diff>
--- a/Mil.Paperwork.Domain/Templates/ExtractFromBookOfLossesTemplate.docx
+++ b/Mil.Paperwork.Domain/Templates/ExtractFromBookOfLossesTemplate.docx
@@ -1,6 +1,6 @@
 
 <file path=word/document.xml><?xml version="1.0" encoding="utf-8"?>
-<w:document xmlns:wpc="http://schemas.microsoft.com/office/word/2010/wordprocessingCanvas" xmlns:cx="http://schemas.microsoft.com/office/drawing/2014/chartex" xmlns:cx1="http://schemas.microsoft.com/office/drawing/2015/9/8/chartex" xmlns:cx2="http://schemas.microsoft.com/office/drawing/2015/10/21/chartex" xmlns:cx3="http://schemas.microsoft.com/office/drawing/2016/5/9/chartex" xmlns:cx4="http://schemas.microsoft.com/office/drawing/2016/5/10/chartex" xmlns:cx5="http://schemas.microsoft.com/office/drawing/2016/5/11/chartex" xmlns:cx6="http://schemas.microsoft.com/office/drawing/2016/5/12/chartex" xmlns:cx7="http://schemas.microsoft.com/office/drawing/2016/5/13/chartex" xmlns:cx8="http://schemas.microsoft.com/office/drawing/2016/5/14/chartex" xmlns:mc="http://schemas.openxmlformats.org/markup-compatibility/2006" xmlns:aink="http://schemas.microsoft.com/office/drawing/2016/ink" xmlns:am3d="http://schemas.microsoft.com/office/drawing/2017/model3d" xmlns:o="urn:schemas-microsoft-com:office:office" xmlns:r="http://schemas.openxmlformats.org/officeDocument/2006/relationships" xmlns:m="http://schemas.openxmlformats.org/officeDocument/2006/math" xmlns:v="urn:schemas-microsoft-com:vml" xmlns:wp14="http://schemas.microsoft.com/office/word/2010/wordprocessingDrawing" xmlns:wp="http://schemas.openxmlformats.org/drawingml/2006/wordprocessingDrawing" xmlns:w10="urn:schemas-microsoft-com:office:word" xmlns:w="http://schemas.openxmlformats.org/wordprocessingml/2006/main" xmlns:w14="http://schemas.microsoft.com/office/word/2010/wordml" xmlns:w15="http://schemas.microsoft.com/office/word/2012/wordml" xmlns:w16cex="http://schemas.microsoft.com/office/word/2018/wordml/cex" xmlns:w16cid="http://schemas.microsoft.com/office/word/2016/wordml/cid" xmlns:w16="http://schemas.microsoft.com/office/word/2018/wordml" xmlns:w16sdtdh="http://schemas.microsoft.com/office/word/2020/wordml/sdtdatahash" xmlns:w16se="http://schemas.microsoft.com/office/word/2015/wordml/symex" xmlns:wpg="http://schemas.microsoft.com/office/word/2010/wordprocessingGroup" xmlns:wpi="http://schemas.microsoft.com/office/word/2010/wordprocessingInk" xmlns:wne="http://schemas.microsoft.com/office/word/2006/wordml" xmlns:wps="http://schemas.microsoft.com/office/word/2010/wordprocessingShape" mc:Ignorable="w14 w15 w16se w16cid w16 w16cex w16sdtdh wp14">
+<w:document xmlns:wpc="http://schemas.microsoft.com/office/word/2010/wordprocessingCanvas" xmlns:cx="http://schemas.microsoft.com/office/drawing/2014/chartex" xmlns:cx1="http://schemas.microsoft.com/office/drawing/2015/9/8/chartex" xmlns:cx2="http://schemas.microsoft.com/office/drawing/2015/10/21/chartex" xmlns:cx3="http://schemas.microsoft.com/office/drawing/2016/5/9/chartex" xmlns:cx4="http://schemas.microsoft.com/office/drawing/2016/5/10/chartex" xmlns:cx5="http://schemas.microsoft.com/office/drawing/2016/5/11/chartex" xmlns:cx6="http://schemas.microsoft.com/office/drawing/2016/5/12/chartex" xmlns:cx7="http://schemas.microsoft.com/office/drawing/2016/5/13/chartex" xmlns:cx8="http://schemas.microsoft.com/office/drawing/2016/5/14/chartex" xmlns:mc="http://schemas.openxmlformats.org/markup-compatibility/2006" xmlns:aink="http://schemas.microsoft.com/office/drawing/2016/ink" xmlns:am3d="http://schemas.microsoft.com/office/drawing/2017/model3d" xmlns:o="urn:schemas-microsoft-com:office:office" xmlns:oel="http://schemas.microsoft.com/office/2019/extlst" xmlns:r="http://schemas.openxmlformats.org/officeDocument/2006/relationships" xmlns:m="http://schemas.openxmlformats.org/officeDocument/2006/math" xmlns:v="urn:schemas-microsoft-com:vml" xmlns:wp14="http://schemas.microsoft.com/office/word/2010/wordprocessingDrawing" xmlns:wp="http://schemas.openxmlformats.org/drawingml/2006/wordprocessingDrawing" xmlns:w10="urn:schemas-microsoft-com:office:word" xmlns:w="http://schemas.openxmlformats.org/wordprocessingml/2006/main" xmlns:w14="http://schemas.microsoft.com/office/word/2010/wordml" xmlns:w15="http://schemas.microsoft.com/office/word/2012/wordml" xmlns:w16cex="http://schemas.microsoft.com/office/word/2018/wordml/cex" xmlns:w16cid="http://schemas.microsoft.com/office/word/2016/wordml/cid" xmlns:w16="http://schemas.microsoft.com/office/word/2018/wordml" xmlns:w16du="http://schemas.microsoft.com/office/word/2023/wordml/word16du" xmlns:w16sdtdh="http://schemas.microsoft.com/office/word/2020/wordml/sdtdatahash" xmlns:w16se="http://schemas.microsoft.com/office/word/2015/wordml/symex" xmlns:wpg="http://schemas.microsoft.com/office/word/2010/wordprocessingGroup" xmlns:wpi="http://schemas.microsoft.com/office/word/2010/wordprocessingInk" xmlns:wne="http://schemas.microsoft.com/office/word/2006/wordml" xmlns:wps="http://schemas.microsoft.com/office/word/2010/wordprocessingShape" mc:Ignorable="w14 w15 w16se w16cid w16 w16cex w16sdtdh w16du wp14">
   <w:body>
     <w:p>
       <w:pPr>
@@ -82,56 +82,123 @@
       </w:pPr>
       <w:r>
         <w:rPr>
+          <w:bCs/>
+          <w:sz w:val="24"/>
+          <w:szCs w:val="24"/>
+        </w:rPr>
+        <w:t xml:space="preserve">з книги обліку </w:t>
+      </w:r>
+      <w:r>
+        <w:rPr>
+          <w:bCs/>
+          <w:sz w:val="24"/>
+          <w:szCs w:val="24"/>
+        </w:rPr>
+        <w:t>втрат військового майна служби зв’язку</w:t>
+      </w:r>
+      <w:r>
+        <w:rPr>
+          <w:bCs/>
+          <w:sz w:val="24"/>
+          <w:szCs w:val="24"/>
+        </w:rPr>
+        <w:t xml:space="preserve"> військової частини </w:t>
+      </w:r>
+      <w:bookmarkStart w:id="1" w:name="_Hlk210685201"/>
+      <w:r>
+        <w:rPr>
+          <w:bCs/>
+          <w:color w:val="000000"/>
+          <w:sz w:val="24"/>
+          <w:szCs w:val="24"/>
+        </w:rPr>
+        <w:fldChar w:fldCharType="begin"/>
+      </w:r>
+      <w:r>
+        <w:rPr>
+          <w:bCs/>
+          <w:color w:val="000000"/>
+          <w:sz w:val="24"/>
+          <w:szCs w:val="24"/>
+        </w:rPr>
+        <w:instrText xml:space="preserve"> MERGEFIELD  MIL_UNIT  \* MERGEFORMAT </w:instrText>
+      </w:r>
+      <w:r>
+        <w:rPr>
+          <w:bCs/>
+          <w:color w:val="000000"/>
+          <w:sz w:val="24"/>
+          <w:szCs w:val="24"/>
+        </w:rPr>
+        <w:fldChar w:fldCharType="separate"/>
+      </w:r>
+      <w:r>
+        <w:rPr>
+          <w:bCs/>
+          <w:noProof/>
+          <w:color w:val="000000"/>
+          <w:sz w:val="24"/>
+          <w:szCs w:val="24"/>
+        </w:rPr>
+        <w:t>«MIL_UNIT»</w:t>
+      </w:r>
+      <w:r>
+        <w:rPr>
+          <w:bCs/>
+          <w:color w:val="000000"/>
+          <w:sz w:val="24"/>
+          <w:szCs w:val="24"/>
+        </w:rPr>
+        <w:fldChar w:fldCharType="end"/>
+      </w:r>
+      <w:bookmarkEnd w:id="0"/>
+      <w:bookmarkEnd w:id="1"/>
+      <w:r>
+        <w:rPr>
           <w:b/>
           <w:sz w:val="24"/>
           <w:szCs w:val="24"/>
-        </w:rPr>
-        <w:t xml:space="preserve">з книги обліку </w:t>
-      </w:r>
-      <w:r>
-        <w:rPr>
-          <w:b/>
-          <w:sz w:val="24"/>
-          <w:szCs w:val="24"/>
-        </w:rPr>
-        <w:t>втрат військового майна служби зв’язку</w:t>
-      </w:r>
-      <w:r>
-        <w:rPr>
-          <w:b/>
-          <w:sz w:val="24"/>
-          <w:szCs w:val="24"/>
-        </w:rPr>
-        <w:t xml:space="preserve"> військової частини </w:t>
-      </w:r>
-      <w:bookmarkStart w:id="1" w:name="_Hlk210685201"/>
+          <w:lang w:eastAsia="en-US"/>
+        </w:rPr>
+        <w:t xml:space="preserve"> </w:t>
+      </w:r>
       <w:r>
         <w:rPr>
           <w:b/>
           <w:bCs/>
-          <w:color w:val="000000"/>
-          <w:sz w:val="24"/>
-          <w:szCs w:val="24"/>
-        </w:rPr>
-        <w:fldChar w:fldCharType="begin"/>
+          <w:sz w:val="24"/>
+          <w:szCs w:val="24"/>
+          <w:u w:val="single"/>
+        </w:rPr>
+        <w:t>№</w:t>
       </w:r>
       <w:r>
         <w:rPr>
           <w:b/>
           <w:bCs/>
-          <w:color w:val="000000"/>
-          <w:sz w:val="24"/>
-          <w:szCs w:val="24"/>
-        </w:rPr>
-        <w:instrText xml:space="preserve"> MERGEFIELD  MIL_UNIT  \* MERGEFORMAT </w:instrText>
+          <w:sz w:val="24"/>
+          <w:szCs w:val="24"/>
+          <w:u w:val="single"/>
+        </w:rPr>
+        <w:fldChar w:fldCharType="begin"/>
       </w:r>
       <w:r>
         <w:rPr>
           <w:b/>
           <w:bCs/>
-          <w:color w:val="000000"/>
-          <w:sz w:val="24"/>
-          <w:szCs w:val="24"/>
+          <w:sz w:val="24"/>
+          <w:szCs w:val="24"/>
+          <w:u w:val="single"/>
+        </w:rPr>
+        <w:instrText xml:space="preserve"> MERGEFIELD  BOOK_NUM  \* MERGEFORMAT </w:instrText>
+      </w:r>
+      <w:r>
+        <w:rPr>
+          <w:b/>
+          <w:bCs/>
+          <w:sz w:val="24"/>
+          <w:szCs w:val="24"/>
+          <w:u w:val="single"/>
         </w:rPr>
         <w:fldChar w:fldCharType="separate"/>
       </w:r>
@@ -140,203 +207,16 @@
           <w:b/>
           <w:bCs/>
           <w:noProof/>
-          <w:color w:val="000000"/>
-          <w:sz w:val="24"/>
-          <w:szCs w:val="24"/>
-        </w:rPr>
-        <w:t>«MIL_UNIT»</w:t>
+          <w:sz w:val="24"/>
+          <w:szCs w:val="24"/>
+          <w:u w:val="single"/>
+        </w:rPr>
+        <w:t>«BOOK_NUM»</w:t>
       </w:r>
       <w:r>
         <w:rPr>
           <w:b/>
           <w:bCs/>
-          <w:color w:val="000000"/>
-          <w:sz w:val="24"/>
-          <w:szCs w:val="24"/>
-        </w:rPr>
-        <w:fldChar w:fldCharType="end"/>
-      </w:r>
-      <w:bookmarkEnd w:id="1"/>
-    </w:p>
-    <w:bookmarkEnd w:id="0"/>
-    <w:p>
-      <w:pPr>
-        <w:jc w:val="center"/>
-        <w:rPr>
-          <w:sz w:val="24"/>
-          <w:szCs w:val="24"/>
-          <w:u w:val="single"/>
-        </w:rPr>
-      </w:pPr>
-      <w:r>
-        <w:rPr>
-          <w:sz w:val="24"/>
-          <w:szCs w:val="24"/>
-        </w:rPr>
-        <w:t xml:space="preserve">за номенклатурою справ на </w:t>
-      </w:r>
-      <w:r>
-        <w:rPr>
-          <w:sz w:val="24"/>
-          <w:szCs w:val="24"/>
-        </w:rPr>
-        <w:fldChar w:fldCharType="begin"/>
-      </w:r>
-      <w:r>
-        <w:rPr>
-          <w:sz w:val="24"/>
-          <w:szCs w:val="24"/>
-        </w:rPr>
-        <w:instrText xml:space="preserve"> MERGEFIELD  BOOK_YEAR  \* MERGEFORMAT </w:instrText>
-      </w:r>
-      <w:r>
-        <w:rPr>
-          <w:sz w:val="24"/>
-          <w:szCs w:val="24"/>
-        </w:rPr>
-        <w:fldChar w:fldCharType="separate"/>
-      </w:r>
-      <w:r>
-        <w:rPr>
-          <w:noProof/>
-          <w:sz w:val="24"/>
-          <w:szCs w:val="24"/>
-        </w:rPr>
-        <w:t>«BOOK_YEAR»</w:t>
-      </w:r>
-      <w:r>
-        <w:rPr>
-          <w:sz w:val="24"/>
-          <w:szCs w:val="24"/>
-        </w:rPr>
-        <w:fldChar w:fldCharType="end"/>
-      </w:r>
-      <w:r>
-        <w:rPr>
-          <w:sz w:val="24"/>
-          <w:szCs w:val="24"/>
-          <w:lang w:val="en-US"/>
-        </w:rPr>
-        <w:t xml:space="preserve"> </w:t>
-      </w:r>
-      <w:r>
-        <w:rPr>
-          <w:sz w:val="24"/>
-          <w:szCs w:val="24"/>
-        </w:rPr>
-        <w:t xml:space="preserve">рік </w:t>
-      </w:r>
-      <w:r>
-        <w:rPr>
-          <w:b/>
-          <w:bCs/>
-          <w:sz w:val="24"/>
-          <w:szCs w:val="24"/>
-          <w:u w:val="single"/>
-        </w:rPr>
-        <w:t>№</w:t>
-      </w:r>
-      <w:r>
-        <w:rPr>
-          <w:b/>
-          <w:bCs/>
-          <w:sz w:val="24"/>
-          <w:szCs w:val="24"/>
-          <w:u w:val="single"/>
-        </w:rPr>
-        <w:fldChar w:fldCharType="begin"/>
-      </w:r>
-      <w:r>
-        <w:rPr>
-          <w:b/>
-          <w:bCs/>
-          <w:sz w:val="24"/>
-          <w:szCs w:val="24"/>
-          <w:u w:val="single"/>
-        </w:rPr>
-        <w:instrText xml:space="preserve"> MERGEFIELD  BOOK_NUM  \* MERGEFORMAT </w:instrText>
-      </w:r>
-      <w:r>
-        <w:rPr>
-          <w:b/>
-          <w:bCs/>
-          <w:sz w:val="24"/>
-          <w:szCs w:val="24"/>
-          <w:u w:val="single"/>
-        </w:rPr>
-        <w:fldChar w:fldCharType="separate"/>
-      </w:r>
-      <w:r>
-        <w:rPr>
-          <w:b/>
-          <w:bCs/>
-          <w:noProof/>
-          <w:sz w:val="24"/>
-          <w:szCs w:val="24"/>
-          <w:u w:val="single"/>
-        </w:rPr>
-        <w:t>«BOOK_NUM»</w:t>
-      </w:r>
-      <w:r>
-        <w:rPr>
-          <w:b/>
-          <w:bCs/>
-          <w:sz w:val="24"/>
-          <w:szCs w:val="24"/>
-          <w:u w:val="single"/>
-        </w:rPr>
-        <w:fldChar w:fldCharType="end"/>
-      </w:r>
-      <w:r>
-        <w:rPr>
-          <w:sz w:val="24"/>
-          <w:szCs w:val="24"/>
-          <w:lang w:val="en-US"/>
-        </w:rPr>
-        <w:t xml:space="preserve"> </w:t>
-      </w:r>
-      <w:r>
-        <w:rPr>
-          <w:sz w:val="24"/>
-          <w:szCs w:val="24"/>
-        </w:rPr>
-        <w:t xml:space="preserve">сторінка № </w:t>
-      </w:r>
-      <w:r>
-        <w:rPr>
-          <w:sz w:val="24"/>
-          <w:szCs w:val="24"/>
-          <w:u w:val="single"/>
-        </w:rPr>
-        <w:fldChar w:fldCharType="begin"/>
-      </w:r>
-      <w:r>
-        <w:rPr>
-          <w:sz w:val="24"/>
-          <w:szCs w:val="24"/>
-          <w:u w:val="single"/>
-        </w:rPr>
-        <w:instrText xml:space="preserve"> MERGEFIELD  PAGE_NUM  \* MERGEFORMAT </w:instrText>
-      </w:r>
-      <w:r>
-        <w:rPr>
-          <w:sz w:val="24"/>
-          <w:szCs w:val="24"/>
-          <w:u w:val="single"/>
-        </w:rPr>
-        <w:fldChar w:fldCharType="separate"/>
-      </w:r>
-      <w:r>
-        <w:rPr>
-          <w:noProof/>
-          <w:sz w:val="24"/>
-          <w:szCs w:val="24"/>
-          <w:u w:val="single"/>
-        </w:rPr>
-        <w:t>«PAGE_NUM»</w:t>
-      </w:r>
-      <w:r>
-        <w:rPr>
           <w:sz w:val="24"/>
           <w:szCs w:val="24"/>
           <w:u w:val="single"/>
@@ -2129,6 +2009,7 @@
                 <w:lang w:eastAsia="uk-UA"/>
               </w:rPr>
             </w:pPr>
+            <w:proofErr w:type="spellStart"/>
             <w:r>
               <w:rPr>
                 <w:color w:val="000000"/>
@@ -2138,6 +2019,7 @@
               </w:rPr>
               <w:t>Розукомпле-ктування</w:t>
             </w:r>
+            <w:proofErr w:type="spellEnd"/>
           </w:p>
         </w:tc>
         <w:tc>
@@ -3385,8 +3267,9 @@
                 <w:szCs w:val="16"/>
                 <w:lang w:eastAsia="uk-UA"/>
               </w:rPr>
-              <w:t>«ORDEN_DATE»</w:t>
-            </w:r>
+              <w:t>«</w:t>
+            </w:r>
+            <w:proofErr w:type="spellStart"/>
             <w:r>
               <w:rPr>
                 <w:b/>
@@ -3395,7 +3278,7 @@
                 <w:szCs w:val="16"/>
                 <w:lang w:eastAsia="uk-UA"/>
               </w:rPr>
-              <w:fldChar w:fldCharType="end"/>
+              <w:t>ORDEN_DATE»</w:t>
             </w:r>
             <w:r>
               <w:rPr>
@@ -3405,7 +3288,28 @@
                 <w:szCs w:val="16"/>
                 <w:lang w:eastAsia="uk-UA"/>
               </w:rPr>
-              <w:t>р №</w:t>
+              <w:fldChar w:fldCharType="end"/>
+            </w:r>
+            <w:r>
+              <w:rPr>
+                <w:b/>
+                <w:bCs/>
+                <w:sz w:val="16"/>
+                <w:szCs w:val="16"/>
+                <w:lang w:eastAsia="uk-UA"/>
+              </w:rPr>
+              <w:t>р</w:t>
+            </w:r>
+            <w:proofErr w:type="spellEnd"/>
+            <w:r>
+              <w:rPr>
+                <w:b/>
+                <w:bCs/>
+                <w:sz w:val="16"/>
+                <w:szCs w:val="16"/>
+                <w:lang w:eastAsia="uk-UA"/>
+              </w:rPr>
+              <w:t xml:space="preserve"> №</w:t>
             </w:r>
             <w:r>
               <w:rPr>
@@ -4644,7 +4548,7 @@
           <w:szCs w:val="24"/>
           <w:lang w:val="ru-RU"/>
         </w:rPr>
-        <w:t>2025</w:t>
+        <w:t>2026</w:t>
       </w:r>
       <w:r>
         <w:rPr>
@@ -4687,7 +4591,7 @@
 </file>
 
 <file path=word/styles.xml><?xml version="1.0" encoding="utf-8"?>
-<w:styles xmlns:mc="http://schemas.openxmlformats.org/markup-compatibility/2006" xmlns:r="http://schemas.openxmlformats.org/officeDocument/2006/relationships" xmlns:w="http://schemas.openxmlformats.org/wordprocessingml/2006/main" xmlns:w14="http://schemas.microsoft.com/office/word/2010/wordml" xmlns:w15="http://schemas.microsoft.com/office/word/2012/wordml" xmlns:w16cex="http://schemas.microsoft.com/office/word/2018/wordml/cex" xmlns:w16cid="http://schemas.microsoft.com/office/word/2016/wordml/cid" xmlns:w16="http://schemas.microsoft.com/office/word/2018/wordml" xmlns:w16sdtdh="http://schemas.microsoft.com/office/word/2020/wordml/sdtdatahash" xmlns:w16se="http://schemas.microsoft.com/office/word/2015/wordml/symex" mc:Ignorable="w14 w15 w16se w16cid w16 w16cex w16sdtdh">
+<w:styles xmlns:mc="http://schemas.openxmlformats.org/markup-compatibility/2006" xmlns:r="http://schemas.openxmlformats.org/officeDocument/2006/relationships" xmlns:w="http://schemas.openxmlformats.org/wordprocessingml/2006/main" xmlns:w14="http://schemas.microsoft.com/office/word/2010/wordml" xmlns:w15="http://schemas.microsoft.com/office/word/2012/wordml" xmlns:w16cex="http://schemas.microsoft.com/office/word/2018/wordml/cex" xmlns:w16cid="http://schemas.microsoft.com/office/word/2016/wordml/cid" xmlns:w16="http://schemas.microsoft.com/office/word/2018/wordml" xmlns:w16du="http://schemas.microsoft.com/office/word/2023/wordml/word16du" xmlns:w16sdtdh="http://schemas.microsoft.com/office/word/2020/wordml/sdtdatahash" xmlns:w16se="http://schemas.microsoft.com/office/word/2015/wordml/symex" mc:Ignorable="w14 w15 w16se w16cid w16 w16cex w16sdtdh w16du">
   <w:docDefaults>
     <w:rPrDefault>
       <w:rPr>

</xml_diff>